<commit_message>
chore(docx): update self-proof report binary
Co-Authored-By: Claude Opus 4.7 <noreply@anthropic.com>
</commit_message>
<xml_diff>
--- a/0323-高安全性自锁紧型电源连接系统市场占有率证明报告-初版.docx
+++ b/0323-高安全性自锁紧型电源连接系统市场占有率证明报告-初版.docx
@@ -21226,7 +21226,7 @@
       <w:rPr>
         <w:rStyle w:val="af7"/>
       </w:rPr>
-      <w:id w:val="-1094774704"/>
+      <w:id w:val="-817493577"/>
       <w:docPartObj>
         <w:docPartGallery w:val="Page Numbers (Bottom of Page)"/>
         <w:docPartUnique/>
@@ -21264,7 +21264,7 @@
             <w:rStyle w:val="af7"/>
             <w:noProof/>
           </w:rPr>
-          <w:t>35</w:t>
+          <w:t>23</w:t>
         </w:r>
         <w:r>
           <w:rPr>
@@ -21275,11 +21275,6 @@
       </w:p>
     </w:sdtContent>
   </w:sdt>
-  <w:p>
-    <w:pPr>
-      <w:pStyle w:val="a4"/>
-    </w:pPr>
-  </w:p>
 </w:ftr>
 </file>
 
@@ -23030,10 +23025,6 @@
 </file>
 
 <file path=customXml/item1.xml><?xml version="1.0" encoding="utf-8"?>
-<b:Sources xmlns:b="http://schemas.openxmlformats.org/officeDocument/2006/bibliography" xmlns="http://schemas.openxmlformats.org/officeDocument/2006/bibliography" SelectedStyle="\APASixthEditionOfficeOnline.xsl" StyleName="APA" Version="6"/>
-</file>
-
-<file path=customXml/item2.xml><?xml version="1.0" encoding="utf-8"?>
 <s:customData xmlns="http://www.wps.cn/officeDocument/2013/wpsCustomData" xmlns:s="http://www.wps.cn/officeDocument/2013/wpsCustomData">
   <customSectProps>
     <customSectPr/>
@@ -23044,18 +23035,22 @@
 </s:customData>
 </file>
 
+<file path=customXml/item2.xml><?xml version="1.0" encoding="utf-8"?>
+<b:Sources xmlns:b="http://schemas.openxmlformats.org/officeDocument/2006/bibliography" xmlns="http://schemas.openxmlformats.org/officeDocument/2006/bibliography" SelectedStyle="\APASixthEditionOfficeOnline.xsl" StyleName="APA" Version="6"/>
+</file>
+
 <file path=customXml/itemProps1.xml><?xml version="1.0" encoding="utf-8"?>
+<ds:datastoreItem xmlns:ds="http://schemas.openxmlformats.org/officeDocument/2006/customXml" ds:itemID="{B1977F7D-205B-4081-913C-38D41E755F92}">
+  <ds:schemaRefs>
+    <ds:schemaRef ds:uri="http://www.wps.cn/officeDocument/2013/wpsCustomData"/>
+  </ds:schemaRefs>
+</ds:datastoreItem>
+</file>
+
+<file path=customXml/itemProps2.xml><?xml version="1.0" encoding="utf-8"?>
 <ds:datastoreItem xmlns:ds="http://schemas.openxmlformats.org/officeDocument/2006/customXml" ds:itemID="{32687DEA-7C12-4677-84FD-9B8610D80F3C}">
   <ds:schemaRefs>
     <ds:schemaRef ds:uri="http://schemas.openxmlformats.org/officeDocument/2006/bibliography"/>
   </ds:schemaRefs>
 </ds:datastoreItem>
-</file>
-
-<file path=customXml/itemProps2.xml><?xml version="1.0" encoding="utf-8"?>
-<ds:datastoreItem xmlns:ds="http://schemas.openxmlformats.org/officeDocument/2006/customXml" ds:itemID="{B1977F7D-205B-4081-913C-38D41E755F92}">
-  <ds:schemaRefs>
-    <ds:schemaRef ds:uri="http://www.wps.cn/officeDocument/2013/wpsCustomData"/>
-  </ds:schemaRefs>
-</ds:datastoreItem>
 </file>
</xml_diff>